<commit_message>
DTAC readiness: remove Google Analytics, create breach-response runbook, ROPA, sub-processor register, interoperability statement; update DPIA, clinical safety case report, DTAC checklist, roadmap, privacy policy
</commit_message>
<xml_diff>
--- a/docs/advisory-board/Conflict of Interest Register.docx
+++ b/docs/advisory-board/Conflict of Interest Register.docx
@@ -91,13 +91,13 @@
         <w:tblLook w:val="04A0" w:firstRow="1" w:lastRow="0" w:firstColumn="1" w:lastColumn="0" w:noHBand="0" w:noVBand="1"/>
       </w:tblPr>
       <w:tblGrid>
-        <w:gridCol w:w="403"/>
-        <w:gridCol w:w="1427"/>
-        <w:gridCol w:w="1548"/>
-        <w:gridCol w:w="994"/>
-        <w:gridCol w:w="1907"/>
-        <w:gridCol w:w="988"/>
-        <w:gridCol w:w="1324"/>
+        <w:gridCol w:w="400"/>
+        <w:gridCol w:w="1412"/>
+        <w:gridCol w:w="1542"/>
+        <w:gridCol w:w="1055"/>
+        <w:gridCol w:w="1883"/>
+        <w:gridCol w:w="986"/>
+        <w:gridCol w:w="1313"/>
         <w:gridCol w:w="1031"/>
       </w:tblGrid>
       <w:tr>
@@ -106,7 +106,7 @@
         </w:trPr>
         <w:tc>
           <w:tcPr>
-            <w:tcW w:w="403" w:type="dxa"/>
+            <w:tcW w:w="400" w:type="dxa"/>
             <w:shd w:val="clear" w:color="auto" w:fill="475953"/>
           </w:tcPr>
           <w:p>
@@ -122,7 +122,7 @@
         </w:tc>
         <w:tc>
           <w:tcPr>
-            <w:tcW w:w="1427" w:type="dxa"/>
+            <w:tcW w:w="1412" w:type="dxa"/>
             <w:shd w:val="clear" w:color="auto" w:fill="475953"/>
           </w:tcPr>
           <w:p>
@@ -138,7 +138,7 @@
         </w:tc>
         <w:tc>
           <w:tcPr>
-            <w:tcW w:w="1548" w:type="dxa"/>
+            <w:tcW w:w="1542" w:type="dxa"/>
             <w:shd w:val="clear" w:color="auto" w:fill="475953"/>
           </w:tcPr>
           <w:p>
@@ -154,7 +154,7 @@
         </w:tc>
         <w:tc>
           <w:tcPr>
-            <w:tcW w:w="994" w:type="dxa"/>
+            <w:tcW w:w="1055" w:type="dxa"/>
             <w:shd w:val="clear" w:color="auto" w:fill="475953"/>
           </w:tcPr>
           <w:p>
@@ -170,7 +170,7 @@
         </w:tc>
         <w:tc>
           <w:tcPr>
-            <w:tcW w:w="1907" w:type="dxa"/>
+            <w:tcW w:w="1883" w:type="dxa"/>
             <w:shd w:val="clear" w:color="auto" w:fill="475953"/>
           </w:tcPr>
           <w:p>
@@ -186,7 +186,7 @@
         </w:tc>
         <w:tc>
           <w:tcPr>
-            <w:tcW w:w="988" w:type="dxa"/>
+            <w:tcW w:w="986" w:type="dxa"/>
             <w:shd w:val="clear" w:color="auto" w:fill="475953"/>
           </w:tcPr>
           <w:p>
@@ -202,7 +202,7 @@
         </w:tc>
         <w:tc>
           <w:tcPr>
-            <w:tcW w:w="1324" w:type="dxa"/>
+            <w:tcW w:w="1313" w:type="dxa"/>
             <w:shd w:val="clear" w:color="auto" w:fill="475953"/>
           </w:tcPr>
           <w:p>
@@ -239,7 +239,7 @@
         </w:trPr>
         <w:tc>
           <w:tcPr>
-            <w:tcW w:w="403" w:type="dxa"/>
+            <w:tcW w:w="400" w:type="dxa"/>
           </w:tcPr>
           <w:p>
             <w:r>
@@ -252,7 +252,7 @@
         </w:tc>
         <w:tc>
           <w:tcPr>
-            <w:tcW w:w="1427" w:type="dxa"/>
+            <w:tcW w:w="1412" w:type="dxa"/>
           </w:tcPr>
           <w:p>
             <w:r>
@@ -265,7 +265,7 @@
         </w:tc>
         <w:tc>
           <w:tcPr>
-            <w:tcW w:w="1548" w:type="dxa"/>
+            <w:tcW w:w="1542" w:type="dxa"/>
           </w:tcPr>
           <w:p>
             <w:r>
@@ -278,13 +278,17 @@
         </w:tc>
         <w:tc>
           <w:tcPr>
-            <w:tcW w:w="994" w:type="dxa"/>
+            <w:tcW w:w="1055" w:type="dxa"/>
           </w:tcPr>
-          <w:p/>
+          <w:p>
+            <w:r>
+              <w:t>10/08/26</w:t>
+            </w:r>
+          </w:p>
         </w:tc>
         <w:tc>
           <w:tcPr>
-            <w:tcW w:w="1907" w:type="dxa"/>
+            <w:tcW w:w="1883" w:type="dxa"/>
           </w:tcPr>
           <w:p>
             <w:r>
@@ -297,7 +301,7 @@
         </w:tc>
         <w:tc>
           <w:tcPr>
-            <w:tcW w:w="988" w:type="dxa"/>
+            <w:tcW w:w="986" w:type="dxa"/>
           </w:tcPr>
           <w:p>
             <w:r>
@@ -310,7 +314,7 @@
         </w:tc>
         <w:tc>
           <w:tcPr>
-            <w:tcW w:w="1324" w:type="dxa"/>
+            <w:tcW w:w="1313" w:type="dxa"/>
           </w:tcPr>
           <w:p>
             <w:r>
@@ -334,7 +338,7 @@
         </w:trPr>
         <w:tc>
           <w:tcPr>
-            <w:tcW w:w="403" w:type="dxa"/>
+            <w:tcW w:w="400" w:type="dxa"/>
             <w:shd w:val="clear" w:color="auto" w:fill="EEF3EC"/>
           </w:tcPr>
           <w:p>
@@ -348,14 +352,35 @@
         </w:tc>
         <w:tc>
           <w:tcPr>
-            <w:tcW w:w="1427" w:type="dxa"/>
+            <w:tcW w:w="1412" w:type="dxa"/>
             <w:shd w:val="clear" w:color="auto" w:fill="EEF3EC"/>
           </w:tcPr>
-          <w:p/>
+          <w:p>
+            <w:proofErr w:type="spellStart"/>
+            <w:r>
+              <w:rPr>
+                <w:sz w:val="20"/>
+              </w:rPr>
+              <w:t>Mr</w:t>
+            </w:r>
+            <w:proofErr w:type="spellEnd"/>
+            <w:r>
+              <w:rPr>
+                <w:sz w:val="20"/>
+              </w:rPr>
+              <w:t xml:space="preserve"> </w:t>
+            </w:r>
+            <w:r>
+              <w:rPr>
+                <w:sz w:val="20"/>
+              </w:rPr>
+              <w:t>Tom Murphy</w:t>
+            </w:r>
+          </w:p>
         </w:tc>
         <w:tc>
           <w:tcPr>
-            <w:tcW w:w="1548" w:type="dxa"/>
+            <w:tcW w:w="1542" w:type="dxa"/>
             <w:shd w:val="clear" w:color="auto" w:fill="EEF3EC"/>
           </w:tcPr>
           <w:p>
@@ -369,31 +394,59 @@
         </w:tc>
         <w:tc>
           <w:tcPr>
-            <w:tcW w:w="994" w:type="dxa"/>
+            <w:tcW w:w="1055" w:type="dxa"/>
             <w:shd w:val="clear" w:color="auto" w:fill="EEF3EC"/>
           </w:tcPr>
-          <w:p/>
+          <w:p>
+            <w:r>
+              <w:t>10/08/26</w:t>
+            </w:r>
+          </w:p>
         </w:tc>
         <w:tc>
           <w:tcPr>
-            <w:tcW w:w="1907" w:type="dxa"/>
+            <w:tcW w:w="1883" w:type="dxa"/>
             <w:shd w:val="clear" w:color="auto" w:fill="EEF3EC"/>
           </w:tcPr>
-          <w:p/>
+          <w:p>
+            <w:r>
+              <w:rPr>
+                <w:sz w:val="20"/>
+              </w:rPr>
+              <w:t>shareholder of Joint Journey</w:t>
+            </w:r>
+            <w:r>
+              <w:rPr>
+                <w:sz w:val="20"/>
+              </w:rPr>
+              <w:t xml:space="preserve"> and potential involvement in decision making in utilization at Bristol NHS foundation Trust</w:t>
+            </w:r>
+          </w:p>
         </w:tc>
         <w:tc>
           <w:tcPr>
-            <w:tcW w:w="988" w:type="dxa"/>
+            <w:tcW w:w="986" w:type="dxa"/>
             <w:shd w:val="clear" w:color="auto" w:fill="EEF3EC"/>
           </w:tcPr>
-          <w:p/>
+          <w:p>
+            <w:r>
+              <w:rPr>
+                <w:sz w:val="20"/>
+              </w:rPr>
+              <w:t>Financial</w:t>
+            </w:r>
+          </w:p>
         </w:tc>
         <w:tc>
           <w:tcPr>
-            <w:tcW w:w="1324" w:type="dxa"/>
+            <w:tcW w:w="1313" w:type="dxa"/>
             <w:shd w:val="clear" w:color="auto" w:fill="EEF3EC"/>
           </w:tcPr>
-          <w:p/>
+          <w:p>
+            <w:r>
+              <w:t>Noted</w:t>
+            </w:r>
+          </w:p>
         </w:tc>
         <w:tc>
           <w:tcPr>
@@ -409,7 +462,7 @@
         </w:trPr>
         <w:tc>
           <w:tcPr>
-            <w:tcW w:w="403" w:type="dxa"/>
+            <w:tcW w:w="400" w:type="dxa"/>
           </w:tcPr>
           <w:p>
             <w:r>
@@ -422,13 +475,17 @@
         </w:tc>
         <w:tc>
           <w:tcPr>
-            <w:tcW w:w="1427" w:type="dxa"/>
+            <w:tcW w:w="1412" w:type="dxa"/>
           </w:tcPr>
-          <w:p/>
+          <w:p>
+            <w:r>
+              <w:t>Mariam Sabet</w:t>
+            </w:r>
+          </w:p>
         </w:tc>
         <w:tc>
           <w:tcPr>
-            <w:tcW w:w="1548" w:type="dxa"/>
+            <w:tcW w:w="1542" w:type="dxa"/>
           </w:tcPr>
           <w:p>
             <w:r>
@@ -441,27 +498,49 @@
         </w:tc>
         <w:tc>
           <w:tcPr>
-            <w:tcW w:w="994" w:type="dxa"/>
+            <w:tcW w:w="1055" w:type="dxa"/>
           </w:tcPr>
-          <w:p/>
+          <w:p>
+            <w:r>
+              <w:t>10/08/26</w:t>
+            </w:r>
+          </w:p>
         </w:tc>
         <w:tc>
           <w:tcPr>
-            <w:tcW w:w="1907" w:type="dxa"/>
+            <w:tcW w:w="1883" w:type="dxa"/>
           </w:tcPr>
-          <w:p/>
+          <w:p>
+            <w:r>
+              <w:rPr>
+                <w:sz w:val="20"/>
+              </w:rPr>
+              <w:t>shareholder of Joint Journey</w:t>
+            </w:r>
+          </w:p>
         </w:tc>
         <w:tc>
           <w:tcPr>
-            <w:tcW w:w="988" w:type="dxa"/>
+            <w:tcW w:w="986" w:type="dxa"/>
           </w:tcPr>
-          <w:p/>
+          <w:p>
+            <w:r>
+              <w:rPr>
+                <w:sz w:val="20"/>
+              </w:rPr>
+              <w:t>Financial</w:t>
+            </w:r>
+          </w:p>
         </w:tc>
         <w:tc>
           <w:tcPr>
-            <w:tcW w:w="1324" w:type="dxa"/>
+            <w:tcW w:w="1313" w:type="dxa"/>
           </w:tcPr>
-          <w:p/>
+          <w:p>
+            <w:r>
+              <w:t>Noted</w:t>
+            </w:r>
+          </w:p>
         </w:tc>
         <w:tc>
           <w:tcPr>
@@ -476,7 +555,7 @@
         </w:trPr>
         <w:tc>
           <w:tcPr>
-            <w:tcW w:w="403" w:type="dxa"/>
+            <w:tcW w:w="400" w:type="dxa"/>
             <w:shd w:val="clear" w:color="auto" w:fill="EEF3EC"/>
           </w:tcPr>
           <w:p>
@@ -490,14 +569,18 @@
         </w:tc>
         <w:tc>
           <w:tcPr>
-            <w:tcW w:w="1427" w:type="dxa"/>
+            <w:tcW w:w="1412" w:type="dxa"/>
             <w:shd w:val="clear" w:color="auto" w:fill="EEF3EC"/>
           </w:tcPr>
-          <w:p/>
+          <w:p>
+            <w:r>
+              <w:t>Shoshanna Freedman</w:t>
+            </w:r>
+          </w:p>
         </w:tc>
         <w:tc>
           <w:tcPr>
-            <w:tcW w:w="1548" w:type="dxa"/>
+            <w:tcW w:w="1542" w:type="dxa"/>
             <w:shd w:val="clear" w:color="auto" w:fill="EEF3EC"/>
           </w:tcPr>
           <w:p>
@@ -511,31 +594,53 @@
         </w:tc>
         <w:tc>
           <w:tcPr>
-            <w:tcW w:w="994" w:type="dxa"/>
+            <w:tcW w:w="1055" w:type="dxa"/>
             <w:shd w:val="clear" w:color="auto" w:fill="EEF3EC"/>
           </w:tcPr>
-          <w:p/>
+          <w:p>
+            <w:r>
+              <w:t>10/08/26</w:t>
+            </w:r>
+          </w:p>
         </w:tc>
         <w:tc>
           <w:tcPr>
-            <w:tcW w:w="1907" w:type="dxa"/>
+            <w:tcW w:w="1883" w:type="dxa"/>
             <w:shd w:val="clear" w:color="auto" w:fill="EEF3EC"/>
           </w:tcPr>
-          <w:p/>
+          <w:p>
+            <w:r>
+              <w:rPr>
+                <w:sz w:val="20"/>
+              </w:rPr>
+              <w:t>shareholder of Joint Journey</w:t>
+            </w:r>
+          </w:p>
         </w:tc>
         <w:tc>
           <w:tcPr>
-            <w:tcW w:w="988" w:type="dxa"/>
+            <w:tcW w:w="986" w:type="dxa"/>
             <w:shd w:val="clear" w:color="auto" w:fill="EEF3EC"/>
           </w:tcPr>
-          <w:p/>
+          <w:p>
+            <w:r>
+              <w:rPr>
+                <w:sz w:val="20"/>
+              </w:rPr>
+              <w:t>Financial</w:t>
+            </w:r>
+          </w:p>
         </w:tc>
         <w:tc>
           <w:tcPr>
-            <w:tcW w:w="1324" w:type="dxa"/>
+            <w:tcW w:w="1313" w:type="dxa"/>
             <w:shd w:val="clear" w:color="auto" w:fill="EEF3EC"/>
           </w:tcPr>
-          <w:p/>
+          <w:p>
+            <w:r>
+              <w:t>Noted</w:t>
+            </w:r>
+          </w:p>
         </w:tc>
         <w:tc>
           <w:tcPr>
@@ -558,7 +663,15 @@
         <w:t xml:space="preserve">Instructions: </w:t>
       </w:r>
       <w:r>
-        <w:t>Add a new row whenever a member joins or an interest changes. Types: Financial / Personal / Loyalty / Indirect.</w:t>
+        <w:t xml:space="preserve">Add a new row whenever a member joins or an </w:t>
+      </w:r>
+      <w:proofErr w:type="gramStart"/>
+      <w:r>
+        <w:t>interest changes</w:t>
+      </w:r>
+      <w:proofErr w:type="gramEnd"/>
+      <w:r>
+        <w:t>. Types: Financial / Personal / Loyalty / Indirect.</w:t>
       </w:r>
     </w:p>
     <w:p>
@@ -596,6 +709,7 @@
         <w:rPr>
           <w:b/>
         </w:rPr>
+        <w:lastRenderedPageBreak/>
         <w:t>Types:</w:t>
       </w:r>
     </w:p>
@@ -635,7 +749,6 @@
         <w:rPr>
           <w:b/>
         </w:rPr>
-        <w:lastRenderedPageBreak/>
         <w:t>Loyalty / Role</w:t>
       </w:r>
       <w:r>
@@ -725,7 +838,7 @@
         <w:t xml:space="preserve">Last full review: </w:t>
       </w:r>
       <w:r>
-        <w:t>___________________</w:t>
+        <w:t>10/8/2026</w:t>
       </w:r>
     </w:p>
     <w:p>
@@ -736,7 +849,7 @@
         <w:t xml:space="preserve">Reviewed by (Chair): </w:t>
       </w:r>
       <w:r>
-        <w:t>___________________</w:t>
+        <w:t>Benjamin Zucker</w:t>
       </w:r>
     </w:p>
     <w:p>
@@ -747,7 +860,7 @@
         <w:t xml:space="preserve">Date: </w:t>
       </w:r>
       <w:r>
-        <w:t>___________________</w:t>
+        <w:t>10/8/2026</w:t>
       </w:r>
     </w:p>
     <w:sectPr>

</xml_diff>